<commit_message>
Correct the age criterion: there is none, and run the >=18 sensitivity
An earlier methods specification listed "age >=18" as an exclusion. That
was inferred, not verified, and is wrong: the analysis set contains 106
patients under 18 (62 IIH, 44 comparators), youngest 13.

Z6 establishes where the bounds come from. The source master spans the
same 13.0-59.1 range, so the cap near 59 was imposed upstream of this
analysis and cannot be explained from any held file; no patient in either
arm is 60 or older. Flagged for the authors to state.

Restricting to >=18 changes nothing material: 2.26 (1.59-3.20) against
2.28 (1.62-3.22); complete matched sets within that restriction 2.10
(1.47-3.00).

Manuscript, abstract, methods specification and results document updated;
"Adults with IIH" replaced with the actual range.

Co-Authored-By: Claude Opus 5 <noreply@anthropic.com>
Claude-Session: https://claude.ai/code/session_0172X8UQDX9VQmAw3MZViyzJ
</commit_message>
<xml_diff>
--- a/report/MANUSCRIPT.docx
+++ b/report/MANUSCRIPT.docx
@@ -226,7 +226,7 @@
           <w:sz w:val="24"/>
           <w:szCs w:val="24"/>
         </w:rPr>
-        <w:t xml:space="preserve"> Matched cohort study in an integrated health-record system. Adults with IIH were matched to comparators without IIH on sex, age, body mass index (BMI) and BMI calendar year, in five relaxing tiers. Comparators inherited the index date of the case to whom they were matched; a 180-day washout and a prevalent-seizure exclusion were applied to both arms at that shared date. Both arms were required to have at least one dated clinical encounter in the 12 months before the index date. The outcome, defined identically in both arms, was a qualifying seizure or epilepsy code after the washout, or anti-seizure medication continued for 180 days or more. Cause-specific hazard ratios were estimated by Cox regression with a robust variance clustered on the matched set. Differential detection was assessed using eleven negative-control outcomes, empirical calibration, six healthcare-contact measures and quantitative bias analysis.</w:t>
+        <w:t xml:space="preserve"> Matched cohort study in an integrated health-record system. Patients with IIH (aged 13–59 years) were matched to comparators without IIH on sex, age, body mass index (BMI) and BMI calendar year, in five relaxing tiers. Comparators inherited the index date of the case to whom they were matched; a 180-day washout and a prevalent-seizure exclusion were applied to both arms at that shared date. Both arms were required to have at least one dated clinical encounter in the 12 months before the index date. The outcome, defined identically in both arms, was a qualifying seizure or epilepsy code after the washout, or anti-seizure medication continued for 180 days or more. Cause-specific hazard ratios were estimated by Cox regression with a robust variance clustered on the matched set. Differential detection was assessed using eleven negative-control outcomes, empirical calibration, six healthcare-contact measures and quantitative bias analysis.</w:t>
       </w:r>
     </w:p>
     <w:p>
@@ -525,7 +525,7 @@
           <w:sz w:val="24"/>
           <w:szCs w:val="24"/>
         </w:rPr>
-        <w:t xml:space="preserve">Adults with a diagnosis of IIH formed the exposed arm. Each case was assigned an index date at diagnosis. Comparators were patients without any IIH code at any date.</w:t>
+        <w:t xml:space="preserve">Patients with a diagnosis of IIH formed the exposed arm. No age criterion was applied by this analysis; ages at index ranged from 13.0 to 59.1 years (median 35.1), the bounds being a property of the supplied extract rather than of the study design. Each case was assigned an index date at diagnosis. Comparators were patients without any IIH code at any date.</w:t>
       </w:r>
     </w:p>
     <w:p>
@@ -2211,6 +2211,63 @@
                 <w:szCs w:val="20"/>
               </w:rPr>
               <w:t xml:space="preserve">2.11 (1.48–3.01)</w:t>
+            </w:r>
+          </w:p>
+        </w:tc>
+      </w:tr>
+      <w:tr>
+        <w:trPr>
+          <w:tblHeader w:val="false"/>
+        </w:trPr>
+        <w:tc>
+          <w:tcPr>
+            <w:tcW w:type="dxa" w:w="6360"/>
+            <w:tcMar>
+              <w:top w:type="dxa" w:w="60"/>
+              <w:left w:type="dxa" w:w="108"/>
+              <w:bottom w:type="dxa" w:w="60"/>
+              <w:right w:type="dxa" w:w="108"/>
+            </w:tcMar>
+          </w:tcPr>
+          <w:p>
+            <w:pPr>
+              <w:spacing w:after="20" w:before="20" w:line="240"/>
+            </w:pPr>
+            <w:r>
+              <w:rPr>
+                <w:rFonts w:ascii="Times New Roman" w:cs="Times New Roman" w:eastAsia="Times New Roman" w:hAnsi="Times New Roman"/>
+                <w:b w:val="false"/>
+                <w:bCs w:val="false"/>
+                <w:sz w:val="20"/>
+                <w:szCs w:val="20"/>
+              </w:rPr>
+              <w:t xml:space="preserve">Restricted to age ≥18 at index</w:t>
+            </w:r>
+          </w:p>
+        </w:tc>
+        <w:tc>
+          <w:tcPr>
+            <w:tcW w:type="dxa" w:w="3000"/>
+            <w:tcMar>
+              <w:top w:type="dxa" w:w="60"/>
+              <w:left w:type="dxa" w:w="108"/>
+              <w:bottom w:type="dxa" w:w="60"/>
+              <w:right w:type="dxa" w:w="108"/>
+            </w:tcMar>
+          </w:tcPr>
+          <w:p>
+            <w:pPr>
+              <w:spacing w:after="20" w:before="20" w:line="240"/>
+            </w:pPr>
+            <w:r>
+              <w:rPr>
+                <w:rFonts w:ascii="Times New Roman" w:cs="Times New Roman" w:eastAsia="Times New Roman" w:hAnsi="Times New Roman"/>
+                <w:b w:val="false"/>
+                <w:bCs w:val="false"/>
+                <w:sz w:val="20"/>
+                <w:szCs w:val="20"/>
+              </w:rPr>
+              <w:t xml:space="preserve">2.26 (1.59–3.20)</w:t>
             </w:r>
           </w:p>
         </w:tc>

</xml_diff>